<commit_message>
Fix Topical Cluster doc: render figures and populate methodology
Rebuild the three diagrams without columnSpan (some viewers dropped the
spanned cells, so the figures did not display) using stacked
full-width bands and three-column box rows with visible borders and
solid fills. Switch the Methodology bullets to the two-run form so the
section renders. No content changes otherwise.

Co-Authored-By: Claude Opus 4.8 <noreply@anthropic.com>
Claude-Session: https://claude.ai/code/session_01UhVChLeNNjFDr6eASTMGhh
</commit_message>
<xml_diff>
--- a/seo-audit/Trillet-Topical-Cluster-Architecture.docx
+++ b/seo-audit/Trillet-Topical-Cluster-Architecture.docx
@@ -363,12 +363,97 @@
       <w:tblPr>
         <w:tblW w:type="dxa" w:w="9360"/>
         <w:tblBorders>
-          <w:top w:val="single" w:color="FFFFFF" w:sz="4"/>
-          <w:left w:val="single" w:color="FFFFFF" w:sz="4"/>
-          <w:bottom w:val="single" w:color="FFFFFF" w:sz="4"/>
-          <w:right w:val="single" w:color="FFFFFF" w:sz="4"/>
-          <w:insideH w:val="single" w:color="FFFFFF" w:sz="4"/>
-          <w:insideV w:val="single" w:color="FFFFFF" w:sz="4"/>
+          <w:top w:val="single" w:color="9AA6B5" w:sz="4"/>
+          <w:left w:val="single" w:color="9AA6B5" w:sz="4"/>
+          <w:bottom w:val="single" w:color="9AA6B5" w:sz="4"/>
+          <w:right w:val="single" w:color="9AA6B5" w:sz="4"/>
+          <w:insideH w:val="single" w:color="9AA6B5" w:sz="4"/>
+          <w:insideV w:val="single" w:color="9AA6B5" w:sz="4"/>
+        </w:tblBorders>
+      </w:tblPr>
+      <w:tblGrid>
+        <w:gridCol w:w="9360"/>
+      </w:tblGrid>
+      <w:tr>
+        <w:tc>
+          <w:tcPr>
+            <w:tcW w:type="dxa" w:w="9360"/>
+            <w:tcBorders>
+              <w:top w:val="single" w:color="9AA6B5" w:sz="4"/>
+              <w:left w:val="single" w:color="9AA6B5" w:sz="4"/>
+              <w:bottom w:val="single" w:color="9AA6B5" w:sz="4"/>
+              <w:right w:val="single" w:color="9AA6B5" w:sz="4"/>
+            </w:tcBorders>
+            <w:shd w:fill="16223C" w:color="auto" w:val="clear"/>
+            <w:tcMar>
+              <w:top w:type="dxa" w:w="100"/>
+              <w:left w:type="dxa" w:w="80"/>
+              <w:bottom w:type="dxa" w:w="100"/>
+              <w:right w:type="dxa" w:w="80"/>
+            </w:tcMar>
+          </w:tcPr>
+          <w:p>
+            <w:pPr>
+              <w:spacing w:after="20" w:line="240"/>
+              <w:jc w:val="center"/>
+            </w:pPr>
+            <w:r>
+              <w:rPr>
+                <w:rFonts w:ascii="Calibri" w:cs="Calibri" w:eastAsia="Calibri" w:hAnsi="Calibri"/>
+                <w:b/>
+                <w:bCs/>
+                <w:color w:val="FFFFFF"/>
+                <w:sz w:val="12"/>
+                <w:szCs w:val="12"/>
+              </w:rPr>
+              <w:t xml:space="preserve">HUB PAGE</w:t>
+            </w:r>
+          </w:p>
+          <w:p>
+            <w:pPr>
+              <w:spacing w:after="0" w:line="240"/>
+              <w:jc w:val="center"/>
+            </w:pPr>
+            <w:r>
+              <w:rPr>
+                <w:rFonts w:ascii="Calibri" w:cs="Calibri" w:eastAsia="Calibri" w:hAnsi="Calibri"/>
+                <w:b/>
+                <w:bCs/>
+                <w:color w:val="FFFFFF"/>
+                <w:sz w:val="14"/>
+                <w:szCs w:val="14"/>
+              </w:rPr>
+              <w:t xml:space="preserve">targets the broad subject term</w:t>
+            </w:r>
+          </w:p>
+        </w:tc>
+      </w:tr>
+    </w:tbl>
+    <w:p>
+      <w:pPr>
+        <w:spacing w:after="26" w:before="26"/>
+        <w:jc w:val="center"/>
+      </w:pPr>
+      <w:r>
+        <w:rPr>
+          <w:rFonts w:ascii="Calibri" w:cs="Calibri" w:eastAsia="Calibri" w:hAnsi="Calibri"/>
+          <w:color w:val="5A6675"/>
+          <w:sz w:val="13"/>
+          <w:szCs w:val="13"/>
+        </w:rPr>
+        <w:t xml:space="preserve">▲  supporting pages link up to the hub</w:t>
+      </w:r>
+    </w:p>
+    <w:tbl>
+      <w:tblPr>
+        <w:tblW w:type="dxa" w:w="9360"/>
+        <w:tblBorders>
+          <w:top w:val="single" w:color="9AA6B5" w:sz="4"/>
+          <w:left w:val="single" w:color="9AA6B5" w:sz="4"/>
+          <w:bottom w:val="single" w:color="9AA6B5" w:sz="4"/>
+          <w:right w:val="single" w:color="9AA6B5" w:sz="4"/>
+          <w:insideH w:val="single" w:color="9AA6B5" w:sz="4"/>
+          <w:insideV w:val="single" w:color="9AA6B5" w:sz="4"/>
         </w:tblBorders>
       </w:tblPr>
       <w:tblGrid>
@@ -380,112 +465,20 @@
       <w:tr>
         <w:tc>
           <w:tcPr>
-            <w:tcW w:type="dxa" w:w="3000"/>
-            <w:gridSpan w:val="4"/>
-            <w:tcBorders>
-              <w:top w:val="single" w:color="16223C" w:sz="4"/>
-              <w:left w:val="single" w:color="16223C" w:sz="4"/>
-              <w:bottom w:val="single" w:color="16223C" w:sz="4"/>
-              <w:right w:val="single" w:color="16223C" w:sz="4"/>
-            </w:tcBorders>
-            <w:shd w:fill="16223C" w:color="auto" w:val="clear"/>
-            <w:tcMar>
-              <w:top w:type="dxa" w:w="90"/>
+            <w:tcW w:type="dxa" w:w="2340"/>
+            <w:tcBorders>
+              <w:top w:val="single" w:color="9AA6B5" w:sz="4"/>
+              <w:left w:val="single" w:color="9AA6B5" w:sz="4"/>
+              <w:bottom w:val="single" w:color="9AA6B5" w:sz="4"/>
+              <w:right w:val="single" w:color="9AA6B5" w:sz="4"/>
+            </w:tcBorders>
+            <w:shd w:fill="F7F8FA" w:color="auto" w:val="clear"/>
+            <w:tcMar>
+              <w:top w:type="dxa" w:w="100"/>
               <w:left w:type="dxa" w:w="80"/>
-              <w:bottom w:type="dxa" w:w="90"/>
+              <w:bottom w:type="dxa" w:w="100"/>
               <w:right w:type="dxa" w:w="80"/>
             </w:tcMar>
-            <w:vAlign w:val="center"/>
-          </w:tcPr>
-          <w:p>
-            <w:pPr>
-              <w:spacing w:after="20" w:line="240"/>
-              <w:jc w:val="center"/>
-            </w:pPr>
-            <w:r>
-              <w:rPr>
-                <w:rFonts w:ascii="Calibri" w:cs="Calibri" w:eastAsia="Calibri" w:hAnsi="Calibri"/>
-                <w:b/>
-                <w:bCs/>
-                <w:color w:val="FFFFFF"/>
-                <w:sz w:val="12"/>
-                <w:szCs w:val="12"/>
-              </w:rPr>
-              <w:t xml:space="preserve">HUB PAGE</w:t>
-            </w:r>
-          </w:p>
-          <w:p>
-            <w:pPr>
-              <w:spacing w:after="0" w:line="240"/>
-              <w:jc w:val="center"/>
-            </w:pPr>
-            <w:r>
-              <w:rPr>
-                <w:rFonts w:ascii="Calibri" w:cs="Calibri" w:eastAsia="Calibri" w:hAnsi="Calibri"/>
-                <w:b/>
-                <w:bCs/>
-                <w:color w:val="FFFFFF"/>
-                <w:sz w:val="14"/>
-                <w:szCs w:val="14"/>
-              </w:rPr>
-              <w:t xml:space="preserve">targets the broad subject term</w:t>
-            </w:r>
-          </w:p>
-        </w:tc>
-      </w:tr>
-    </w:tbl>
-    <w:p>
-      <w:pPr>
-        <w:spacing w:after="20" w:before="20"/>
-        <w:jc w:val="center"/>
-      </w:pPr>
-      <w:r>
-        <w:rPr>
-          <w:rFonts w:ascii="Calibri" w:cs="Calibri" w:eastAsia="Calibri" w:hAnsi="Calibri"/>
-          <w:color w:val="5A6675"/>
-          <w:sz w:val="13"/>
-          <w:szCs w:val="13"/>
-        </w:rPr>
-        <w:t xml:space="preserve">▲  links up to hub</w:t>
-      </w:r>
-    </w:p>
-    <w:tbl>
-      <w:tblPr>
-        <w:tblW w:type="dxa" w:w="9360"/>
-        <w:tblBorders>
-          <w:top w:val="single" w:color="FFFFFF" w:sz="4"/>
-          <w:left w:val="single" w:color="FFFFFF" w:sz="4"/>
-          <w:bottom w:val="single" w:color="FFFFFF" w:sz="4"/>
-          <w:right w:val="single" w:color="FFFFFF" w:sz="4"/>
-          <w:insideH w:val="single" w:color="FFFFFF" w:sz="4"/>
-          <w:insideV w:val="single" w:color="FFFFFF" w:sz="4"/>
-        </w:tblBorders>
-      </w:tblPr>
-      <w:tblGrid>
-        <w:gridCol w:w="2340"/>
-        <w:gridCol w:w="2340"/>
-        <w:gridCol w:w="2340"/>
-        <w:gridCol w:w="2340"/>
-      </w:tblGrid>
-      <w:tr>
-        <w:tc>
-          <w:tcPr>
-            <w:tcW w:type="dxa" w:w="3000"/>
-            <w:gridSpan w:val="1"/>
-            <w:tcBorders>
-              <w:top w:val="single" w:color="D9DEE8" w:sz="4"/>
-              <w:left w:val="single" w:color="D9DEE8" w:sz="4"/>
-              <w:bottom w:val="single" w:color="D9DEE8" w:sz="4"/>
-              <w:right w:val="single" w:color="D9DEE8" w:sz="4"/>
-            </w:tcBorders>
-            <w:shd w:fill="F7F8FA" w:color="auto" w:val="clear"/>
-            <w:tcMar>
-              <w:top w:type="dxa" w:w="90"/>
-              <w:left w:type="dxa" w:w="80"/>
-              <w:bottom w:type="dxa" w:w="90"/>
-              <w:right w:type="dxa" w:w="80"/>
-            </w:tcMar>
-            <w:vAlign w:val="center"/>
           </w:tcPr>
           <w:p>
             <w:pPr>
@@ -524,22 +517,20 @@
         </w:tc>
         <w:tc>
           <w:tcPr>
-            <w:tcW w:type="dxa" w:w="3000"/>
-            <w:gridSpan w:val="1"/>
-            <w:tcBorders>
-              <w:top w:val="single" w:color="D9DEE8" w:sz="4"/>
-              <w:left w:val="single" w:color="D9DEE8" w:sz="4"/>
-              <w:bottom w:val="single" w:color="D9DEE8" w:sz="4"/>
-              <w:right w:val="single" w:color="D9DEE8" w:sz="4"/>
+            <w:tcW w:type="dxa" w:w="2340"/>
+            <w:tcBorders>
+              <w:top w:val="single" w:color="9AA6B5" w:sz="4"/>
+              <w:left w:val="single" w:color="9AA6B5" w:sz="4"/>
+              <w:bottom w:val="single" w:color="9AA6B5" w:sz="4"/>
+              <w:right w:val="single" w:color="9AA6B5" w:sz="4"/>
             </w:tcBorders>
             <w:shd w:fill="F7F8FA" w:color="auto" w:val="clear"/>
             <w:tcMar>
-              <w:top w:type="dxa" w:w="90"/>
+              <w:top w:type="dxa" w:w="100"/>
               <w:left w:type="dxa" w:w="80"/>
-              <w:bottom w:type="dxa" w:w="90"/>
+              <w:bottom w:type="dxa" w:w="100"/>
               <w:right w:type="dxa" w:w="80"/>
             </w:tcMar>
-            <w:vAlign w:val="center"/>
           </w:tcPr>
           <w:p>
             <w:pPr>
@@ -578,22 +569,20 @@
         </w:tc>
         <w:tc>
           <w:tcPr>
-            <w:tcW w:type="dxa" w:w="3000"/>
-            <w:gridSpan w:val="1"/>
-            <w:tcBorders>
-              <w:top w:val="single" w:color="D9DEE8" w:sz="4"/>
-              <w:left w:val="single" w:color="D9DEE8" w:sz="4"/>
-              <w:bottom w:val="single" w:color="D9DEE8" w:sz="4"/>
-              <w:right w:val="single" w:color="D9DEE8" w:sz="4"/>
+            <w:tcW w:type="dxa" w:w="2340"/>
+            <w:tcBorders>
+              <w:top w:val="single" w:color="9AA6B5" w:sz="4"/>
+              <w:left w:val="single" w:color="9AA6B5" w:sz="4"/>
+              <w:bottom w:val="single" w:color="9AA6B5" w:sz="4"/>
+              <w:right w:val="single" w:color="9AA6B5" w:sz="4"/>
             </w:tcBorders>
             <w:shd w:fill="F7F8FA" w:color="auto" w:val="clear"/>
             <w:tcMar>
-              <w:top w:type="dxa" w:w="90"/>
+              <w:top w:type="dxa" w:w="100"/>
               <w:left w:type="dxa" w:w="80"/>
-              <w:bottom w:type="dxa" w:w="90"/>
+              <w:bottom w:type="dxa" w:w="100"/>
               <w:right w:type="dxa" w:w="80"/>
             </w:tcMar>
-            <w:vAlign w:val="center"/>
           </w:tcPr>
           <w:p>
             <w:pPr>
@@ -632,22 +621,20 @@
         </w:tc>
         <w:tc>
           <w:tcPr>
-            <w:tcW w:type="dxa" w:w="3000"/>
-            <w:gridSpan w:val="1"/>
-            <w:tcBorders>
-              <w:top w:val="single" w:color="D9DEE8" w:sz="4"/>
-              <w:left w:val="single" w:color="D9DEE8" w:sz="4"/>
-              <w:bottom w:val="single" w:color="D9DEE8" w:sz="4"/>
-              <w:right w:val="single" w:color="D9DEE8" w:sz="4"/>
+            <w:tcW w:type="dxa" w:w="2340"/>
+            <w:tcBorders>
+              <w:top w:val="single" w:color="9AA6B5" w:sz="4"/>
+              <w:left w:val="single" w:color="9AA6B5" w:sz="4"/>
+              <w:bottom w:val="single" w:color="9AA6B5" w:sz="4"/>
+              <w:right w:val="single" w:color="9AA6B5" w:sz="4"/>
             </w:tcBorders>
             <w:shd w:fill="F7F8FA" w:color="auto" w:val="clear"/>
             <w:tcMar>
-              <w:top w:type="dxa" w:w="90"/>
+              <w:top w:type="dxa" w:w="100"/>
               <w:left w:type="dxa" w:w="80"/>
-              <w:bottom w:type="dxa" w:w="90"/>
+              <w:bottom w:type="dxa" w:w="100"/>
               <w:right w:type="dxa" w:w="80"/>
             </w:tcMar>
-            <w:vAlign w:val="center"/>
           </w:tcPr>
           <w:p>
             <w:pPr>
@@ -894,12 +881,12 @@
       <w:tblPr>
         <w:tblW w:type="dxa" w:w="9360"/>
         <w:tblBorders>
-          <w:top w:val="single" w:color="FFFFFF" w:sz="4"/>
-          <w:left w:val="single" w:color="FFFFFF" w:sz="4"/>
-          <w:bottom w:val="single" w:color="FFFFFF" w:sz="4"/>
-          <w:right w:val="single" w:color="FFFFFF" w:sz="4"/>
-          <w:insideH w:val="single" w:color="FFFFFF" w:sz="4"/>
-          <w:insideV w:val="single" w:color="FFFFFF" w:sz="4"/>
+          <w:top w:val="single" w:color="9AA6B5" w:sz="4"/>
+          <w:left w:val="single" w:color="9AA6B5" w:sz="4"/>
+          <w:bottom w:val="single" w:color="9AA6B5" w:sz="4"/>
+          <w:right w:val="single" w:color="9AA6B5" w:sz="4"/>
+          <w:insideH w:val="single" w:color="9AA6B5" w:sz="4"/>
+          <w:insideV w:val="single" w:color="9AA6B5" w:sz="4"/>
         </w:tblBorders>
       </w:tblPr>
       <w:tblGrid>
@@ -910,22 +897,20 @@
       <w:tr>
         <w:tc>
           <w:tcPr>
-            <w:tcW w:type="dxa" w:w="3000"/>
-            <w:gridSpan w:val="1"/>
-            <w:tcBorders>
-              <w:top w:val="single" w:color="16223C" w:sz="4"/>
-              <w:left w:val="single" w:color="16223C" w:sz="4"/>
-              <w:bottom w:val="single" w:color="16223C" w:sz="4"/>
-              <w:right w:val="single" w:color="16223C" w:sz="4"/>
+            <w:tcW w:type="dxa" w:w="3120"/>
+            <w:tcBorders>
+              <w:top w:val="single" w:color="9AA6B5" w:sz="4"/>
+              <w:left w:val="single" w:color="9AA6B5" w:sz="4"/>
+              <w:bottom w:val="single" w:color="9AA6B5" w:sz="4"/>
+              <w:right w:val="single" w:color="9AA6B5" w:sz="4"/>
             </w:tcBorders>
             <w:shd w:fill="16223C" w:color="auto" w:val="clear"/>
             <w:tcMar>
-              <w:top w:type="dxa" w:w="90"/>
+              <w:top w:type="dxa" w:w="100"/>
               <w:left w:type="dxa" w:w="80"/>
-              <w:bottom w:type="dxa" w:w="90"/>
+              <w:bottom w:type="dxa" w:w="100"/>
               <w:right w:type="dxa" w:w="80"/>
             </w:tcMar>
-            <w:vAlign w:val="center"/>
           </w:tcPr>
           <w:p>
             <w:pPr>
@@ -964,22 +949,20 @@
         </w:tc>
         <w:tc>
           <w:tcPr>
-            <w:tcW w:type="dxa" w:w="3000"/>
-            <w:gridSpan w:val="1"/>
-            <w:tcBorders>
-              <w:top w:val="single" w:color="16223C" w:sz="4"/>
-              <w:left w:val="single" w:color="16223C" w:sz="4"/>
-              <w:bottom w:val="single" w:color="16223C" w:sz="4"/>
-              <w:right w:val="single" w:color="16223C" w:sz="4"/>
+            <w:tcW w:type="dxa" w:w="3120"/>
+            <w:tcBorders>
+              <w:top w:val="single" w:color="9AA6B5" w:sz="4"/>
+              <w:left w:val="single" w:color="9AA6B5" w:sz="4"/>
+              <w:bottom w:val="single" w:color="9AA6B5" w:sz="4"/>
+              <w:right w:val="single" w:color="9AA6B5" w:sz="4"/>
             </w:tcBorders>
             <w:shd w:fill="16223C" w:color="auto" w:val="clear"/>
             <w:tcMar>
-              <w:top w:type="dxa" w:w="90"/>
+              <w:top w:type="dxa" w:w="100"/>
               <w:left w:type="dxa" w:w="80"/>
-              <w:bottom w:type="dxa" w:w="90"/>
+              <w:bottom w:type="dxa" w:w="100"/>
               <w:right w:type="dxa" w:w="80"/>
             </w:tcMar>
-            <w:vAlign w:val="center"/>
           </w:tcPr>
           <w:p>
             <w:pPr>
@@ -1018,22 +1001,20 @@
         </w:tc>
         <w:tc>
           <w:tcPr>
-            <w:tcW w:type="dxa" w:w="3000"/>
-            <w:gridSpan w:val="1"/>
-            <w:tcBorders>
-              <w:top w:val="single" w:color="16223C" w:sz="4"/>
-              <w:left w:val="single" w:color="16223C" w:sz="4"/>
-              <w:bottom w:val="single" w:color="16223C" w:sz="4"/>
-              <w:right w:val="single" w:color="16223C" w:sz="4"/>
+            <w:tcW w:type="dxa" w:w="3120"/>
+            <w:tcBorders>
+              <w:top w:val="single" w:color="9AA6B5" w:sz="4"/>
+              <w:left w:val="single" w:color="9AA6B5" w:sz="4"/>
+              <w:bottom w:val="single" w:color="9AA6B5" w:sz="4"/>
+              <w:right w:val="single" w:color="9AA6B5" w:sz="4"/>
             </w:tcBorders>
             <w:shd w:fill="16223C" w:color="auto" w:val="clear"/>
             <w:tcMar>
-              <w:top w:type="dxa" w:w="90"/>
+              <w:top w:type="dxa" w:w="100"/>
               <w:left w:type="dxa" w:w="80"/>
-              <w:bottom w:type="dxa" w:w="90"/>
+              <w:bottom w:type="dxa" w:w="100"/>
               <w:right w:type="dxa" w:w="80"/>
             </w:tcMar>
-            <w:vAlign w:val="center"/>
           </w:tcPr>
           <w:p>
             <w:pPr>
@@ -1071,25 +1052,41 @@
           </w:p>
         </w:tc>
       </w:tr>
+    </w:tbl>
+    <w:tbl>
+      <w:tblPr>
+        <w:tblW w:type="dxa" w:w="9360"/>
+        <w:tblBorders>
+          <w:top w:val="single" w:color="9AA6B5" w:sz="4"/>
+          <w:left w:val="single" w:color="9AA6B5" w:sz="4"/>
+          <w:bottom w:val="single" w:color="9AA6B5" w:sz="4"/>
+          <w:right w:val="single" w:color="9AA6B5" w:sz="4"/>
+          <w:insideH w:val="single" w:color="9AA6B5" w:sz="4"/>
+          <w:insideV w:val="single" w:color="9AA6B5" w:sz="4"/>
+        </w:tblBorders>
+      </w:tblPr>
+      <w:tblGrid>
+        <w:gridCol w:w="3120"/>
+        <w:gridCol w:w="3120"/>
+        <w:gridCol w:w="3120"/>
+      </w:tblGrid>
       <w:tr>
         <w:tc>
           <w:tcPr>
-            <w:tcW w:type="dxa" w:w="3000"/>
-            <w:gridSpan w:val="1"/>
-            <w:tcBorders>
-              <w:top w:val="single" w:color="D9DEE8" w:sz="4"/>
-              <w:left w:val="single" w:color="D9DEE8" w:sz="4"/>
-              <w:bottom w:val="single" w:color="D9DEE8" w:sz="4"/>
-              <w:right w:val="single" w:color="D9DEE8" w:sz="4"/>
+            <w:tcW w:type="dxa" w:w="3120"/>
+            <w:tcBorders>
+              <w:top w:val="single" w:color="9AA6B5" w:sz="4"/>
+              <w:left w:val="single" w:color="9AA6B5" w:sz="4"/>
+              <w:bottom w:val="single" w:color="9AA6B5" w:sz="4"/>
+              <w:right w:val="single" w:color="9AA6B5" w:sz="4"/>
             </w:tcBorders>
             <w:shd w:fill="F7F8FA" w:color="auto" w:val="clear"/>
             <w:tcMar>
-              <w:top w:type="dxa" w:w="90"/>
+              <w:top w:type="dxa" w:w="100"/>
               <w:left w:type="dxa" w:w="80"/>
-              <w:bottom w:type="dxa" w:w="90"/>
+              <w:bottom w:type="dxa" w:w="100"/>
               <w:right w:type="dxa" w:w="80"/>
             </w:tcMar>
-            <w:vAlign w:val="center"/>
           </w:tcPr>
           <w:p>
             <w:pPr>
@@ -1111,22 +1108,20 @@
         </w:tc>
         <w:tc>
           <w:tcPr>
-            <w:tcW w:type="dxa" w:w="3000"/>
-            <w:gridSpan w:val="1"/>
-            <w:tcBorders>
-              <w:top w:val="single" w:color="D9DEE8" w:sz="4"/>
-              <w:left w:val="single" w:color="D9DEE8" w:sz="4"/>
-              <w:bottom w:val="single" w:color="D9DEE8" w:sz="4"/>
-              <w:right w:val="single" w:color="D9DEE8" w:sz="4"/>
+            <w:tcW w:type="dxa" w:w="3120"/>
+            <w:tcBorders>
+              <w:top w:val="single" w:color="9AA6B5" w:sz="4"/>
+              <w:left w:val="single" w:color="9AA6B5" w:sz="4"/>
+              <w:bottom w:val="single" w:color="9AA6B5" w:sz="4"/>
+              <w:right w:val="single" w:color="9AA6B5" w:sz="4"/>
             </w:tcBorders>
             <w:shd w:fill="F7F8FA" w:color="auto" w:val="clear"/>
             <w:tcMar>
-              <w:top w:type="dxa" w:w="90"/>
+              <w:top w:type="dxa" w:w="100"/>
               <w:left w:type="dxa" w:w="80"/>
-              <w:bottom w:type="dxa" w:w="90"/>
+              <w:bottom w:type="dxa" w:w="100"/>
               <w:right w:type="dxa" w:w="80"/>
             </w:tcMar>
-            <w:vAlign w:val="center"/>
           </w:tcPr>
           <w:p>
             <w:pPr>
@@ -1148,22 +1143,20 @@
         </w:tc>
         <w:tc>
           <w:tcPr>
-            <w:tcW w:type="dxa" w:w="3000"/>
-            <w:gridSpan w:val="1"/>
-            <w:tcBorders>
-              <w:top w:val="single" w:color="D9DEE8" w:sz="4"/>
-              <w:left w:val="single" w:color="D9DEE8" w:sz="4"/>
-              <w:bottom w:val="single" w:color="D9DEE8" w:sz="4"/>
-              <w:right w:val="single" w:color="D9DEE8" w:sz="4"/>
+            <w:tcW w:type="dxa" w:w="3120"/>
+            <w:tcBorders>
+              <w:top w:val="single" w:color="9AA6B5" w:sz="4"/>
+              <w:left w:val="single" w:color="9AA6B5" w:sz="4"/>
+              <w:bottom w:val="single" w:color="9AA6B5" w:sz="4"/>
+              <w:right w:val="single" w:color="9AA6B5" w:sz="4"/>
             </w:tcBorders>
             <w:shd w:fill="F7F8FA" w:color="auto" w:val="clear"/>
             <w:tcMar>
-              <w:top w:type="dxa" w:w="90"/>
+              <w:top w:type="dxa" w:w="100"/>
               <w:left w:type="dxa" w:w="80"/>
-              <w:bottom w:type="dxa" w:w="90"/>
+              <w:bottom w:type="dxa" w:w="100"/>
               <w:right w:type="dxa" w:w="80"/>
             </w:tcMar>
-            <w:vAlign w:val="center"/>
           </w:tcPr>
           <w:p>
             <w:pPr>
@@ -1184,25 +1177,41 @@
           </w:p>
         </w:tc>
       </w:tr>
+    </w:tbl>
+    <w:tbl>
+      <w:tblPr>
+        <w:tblW w:type="dxa" w:w="9360"/>
+        <w:tblBorders>
+          <w:top w:val="single" w:color="9AA6B5" w:sz="4"/>
+          <w:left w:val="single" w:color="9AA6B5" w:sz="4"/>
+          <w:bottom w:val="single" w:color="9AA6B5" w:sz="4"/>
+          <w:right w:val="single" w:color="9AA6B5" w:sz="4"/>
+          <w:insideH w:val="single" w:color="9AA6B5" w:sz="4"/>
+          <w:insideV w:val="single" w:color="9AA6B5" w:sz="4"/>
+        </w:tblBorders>
+      </w:tblPr>
+      <w:tblGrid>
+        <w:gridCol w:w="3120"/>
+        <w:gridCol w:w="3120"/>
+        <w:gridCol w:w="3120"/>
+      </w:tblGrid>
       <w:tr>
         <w:tc>
           <w:tcPr>
-            <w:tcW w:type="dxa" w:w="3000"/>
-            <w:gridSpan w:val="1"/>
-            <w:tcBorders>
-              <w:top w:val="single" w:color="D9DEE8" w:sz="4"/>
-              <w:left w:val="single" w:color="D9DEE8" w:sz="4"/>
-              <w:bottom w:val="single" w:color="D9DEE8" w:sz="4"/>
-              <w:right w:val="single" w:color="D9DEE8" w:sz="4"/>
-            </w:tcBorders>
-            <w:shd w:fill="FFFFFF" w:color="auto" w:val="clear"/>
-            <w:tcMar>
-              <w:top w:type="dxa" w:w="90"/>
+            <w:tcW w:type="dxa" w:w="3120"/>
+            <w:tcBorders>
+              <w:top w:val="single" w:color="9AA6B5" w:sz="4"/>
+              <w:left w:val="single" w:color="9AA6B5" w:sz="4"/>
+              <w:bottom w:val="single" w:color="9AA6B5" w:sz="4"/>
+              <w:right w:val="single" w:color="9AA6B5" w:sz="4"/>
+            </w:tcBorders>
+            <w:shd w:fill="FFFFFF" w:color="auto" w:val="clear"/>
+            <w:tcMar>
+              <w:top w:type="dxa" w:w="100"/>
               <w:left w:type="dxa" w:w="80"/>
-              <w:bottom w:type="dxa" w:w="90"/>
+              <w:bottom w:type="dxa" w:w="100"/>
               <w:right w:type="dxa" w:w="80"/>
             </w:tcMar>
-            <w:vAlign w:val="center"/>
           </w:tcPr>
           <w:p>
             <w:pPr>
@@ -1241,22 +1250,20 @@
         </w:tc>
         <w:tc>
           <w:tcPr>
-            <w:tcW w:type="dxa" w:w="3000"/>
-            <w:gridSpan w:val="1"/>
-            <w:tcBorders>
-              <w:top w:val="single" w:color="D9DEE8" w:sz="4"/>
-              <w:left w:val="single" w:color="D9DEE8" w:sz="4"/>
-              <w:bottom w:val="single" w:color="D9DEE8" w:sz="4"/>
-              <w:right w:val="single" w:color="D9DEE8" w:sz="4"/>
-            </w:tcBorders>
-            <w:shd w:fill="FFFFFF" w:color="auto" w:val="clear"/>
-            <w:tcMar>
-              <w:top w:type="dxa" w:w="90"/>
+            <w:tcW w:type="dxa" w:w="3120"/>
+            <w:tcBorders>
+              <w:top w:val="single" w:color="9AA6B5" w:sz="4"/>
+              <w:left w:val="single" w:color="9AA6B5" w:sz="4"/>
+              <w:bottom w:val="single" w:color="9AA6B5" w:sz="4"/>
+              <w:right w:val="single" w:color="9AA6B5" w:sz="4"/>
+            </w:tcBorders>
+            <w:shd w:fill="FFFFFF" w:color="auto" w:val="clear"/>
+            <w:tcMar>
+              <w:top w:type="dxa" w:w="100"/>
               <w:left w:type="dxa" w:w="80"/>
-              <w:bottom w:type="dxa" w:w="90"/>
+              <w:bottom w:type="dxa" w:w="100"/>
               <w:right w:type="dxa" w:w="80"/>
             </w:tcMar>
-            <w:vAlign w:val="center"/>
           </w:tcPr>
           <w:p>
             <w:pPr>
@@ -1295,22 +1302,20 @@
         </w:tc>
         <w:tc>
           <w:tcPr>
-            <w:tcW w:type="dxa" w:w="3000"/>
-            <w:gridSpan w:val="1"/>
-            <w:tcBorders>
-              <w:top w:val="single" w:color="D9DEE8" w:sz="4"/>
-              <w:left w:val="single" w:color="D9DEE8" w:sz="4"/>
-              <w:bottom w:val="single" w:color="D9DEE8" w:sz="4"/>
-              <w:right w:val="single" w:color="D9DEE8" w:sz="4"/>
-            </w:tcBorders>
-            <w:shd w:fill="FFFFFF" w:color="auto" w:val="clear"/>
-            <w:tcMar>
-              <w:top w:type="dxa" w:w="90"/>
+            <w:tcW w:type="dxa" w:w="3120"/>
+            <w:tcBorders>
+              <w:top w:val="single" w:color="9AA6B5" w:sz="4"/>
+              <w:left w:val="single" w:color="9AA6B5" w:sz="4"/>
+              <w:bottom w:val="single" w:color="9AA6B5" w:sz="4"/>
+              <w:right w:val="single" w:color="9AA6B5" w:sz="4"/>
+            </w:tcBorders>
+            <w:shd w:fill="FFFFFF" w:color="auto" w:val="clear"/>
+            <w:tcMar>
+              <w:top w:type="dxa" w:w="100"/>
               <w:left w:type="dxa" w:w="80"/>
-              <w:bottom w:type="dxa" w:w="90"/>
+              <w:bottom w:type="dxa" w:w="100"/>
               <w:right w:type="dxa" w:w="80"/>
             </w:tcMar>
-            <w:vAlign w:val="center"/>
           </w:tcPr>
           <w:p>
             <w:pPr>
@@ -1348,25 +1353,39 @@
           </w:p>
         </w:tc>
       </w:tr>
+    </w:tbl>
+    <w:tbl>
+      <w:tblPr>
+        <w:tblW w:type="dxa" w:w="9360"/>
+        <w:tblBorders>
+          <w:top w:val="single" w:color="9AA6B5" w:sz="4"/>
+          <w:left w:val="single" w:color="9AA6B5" w:sz="4"/>
+          <w:bottom w:val="single" w:color="9AA6B5" w:sz="4"/>
+          <w:right w:val="single" w:color="9AA6B5" w:sz="4"/>
+          <w:insideH w:val="single" w:color="9AA6B5" w:sz="4"/>
+          <w:insideV w:val="single" w:color="9AA6B5" w:sz="4"/>
+        </w:tblBorders>
+      </w:tblPr>
+      <w:tblGrid>
+        <w:gridCol w:w="9360"/>
+      </w:tblGrid>
       <w:tr>
         <w:tc>
           <w:tcPr>
-            <w:tcW w:type="dxa" w:w="3000"/>
-            <w:gridSpan w:val="3"/>
-            <w:tcBorders>
-              <w:top w:val="single" w:color="D9DEE8" w:sz="4"/>
-              <w:left w:val="single" w:color="D9DEE8" w:sz="4"/>
-              <w:bottom w:val="single" w:color="D9DEE8" w:sz="4"/>
-              <w:right w:val="single" w:color="D9DEE8" w:sz="4"/>
+            <w:tcW w:type="dxa" w:w="9360"/>
+            <w:tcBorders>
+              <w:top w:val="single" w:color="9AA6B5" w:sz="4"/>
+              <w:left w:val="single" w:color="9AA6B5" w:sz="4"/>
+              <w:bottom w:val="single" w:color="9AA6B5" w:sz="4"/>
+              <w:right w:val="single" w:color="9AA6B5" w:sz="4"/>
             </w:tcBorders>
             <w:shd w:fill="EDEFF3" w:color="auto" w:val="clear"/>
             <w:tcMar>
-              <w:top w:type="dxa" w:w="90"/>
+              <w:top w:type="dxa" w:w="100"/>
               <w:left w:type="dxa" w:w="80"/>
-              <w:bottom w:type="dxa" w:w="90"/>
+              <w:bottom w:type="dxa" w:w="100"/>
               <w:right w:type="dxa" w:w="80"/>
             </w:tcMar>
-            <w:vAlign w:val="center"/>
           </w:tcPr>
           <w:p>
             <w:pPr>
@@ -8677,12 +8696,65 @@
       <w:tblPr>
         <w:tblW w:type="dxa" w:w="9360"/>
         <w:tblBorders>
-          <w:top w:val="single" w:color="FFFFFF" w:sz="4"/>
-          <w:left w:val="single" w:color="FFFFFF" w:sz="4"/>
-          <w:bottom w:val="single" w:color="FFFFFF" w:sz="4"/>
-          <w:right w:val="single" w:color="FFFFFF" w:sz="4"/>
-          <w:insideH w:val="single" w:color="FFFFFF" w:sz="4"/>
-          <w:insideV w:val="single" w:color="FFFFFF" w:sz="4"/>
+          <w:top w:val="single" w:color="9AA6B5" w:sz="4"/>
+          <w:left w:val="single" w:color="9AA6B5" w:sz="4"/>
+          <w:bottom w:val="single" w:color="9AA6B5" w:sz="4"/>
+          <w:right w:val="single" w:color="9AA6B5" w:sz="4"/>
+          <w:insideH w:val="single" w:color="9AA6B5" w:sz="4"/>
+          <w:insideV w:val="single" w:color="9AA6B5" w:sz="4"/>
+        </w:tblBorders>
+      </w:tblPr>
+      <w:tblGrid>
+        <w:gridCol w:w="9360"/>
+      </w:tblGrid>
+      <w:tr>
+        <w:tc>
+          <w:tcPr>
+            <w:tcW w:type="dxa" w:w="9360"/>
+            <w:tcBorders>
+              <w:top w:val="single" w:color="9AA6B5" w:sz="4"/>
+              <w:left w:val="single" w:color="9AA6B5" w:sz="4"/>
+              <w:bottom w:val="single" w:color="9AA6B5" w:sz="4"/>
+              <w:right w:val="single" w:color="9AA6B5" w:sz="4"/>
+            </w:tcBorders>
+            <w:shd w:fill="16223C" w:color="auto" w:val="clear"/>
+            <w:tcMar>
+              <w:top w:type="dxa" w:w="100"/>
+              <w:left w:type="dxa" w:w="80"/>
+              <w:bottom w:type="dxa" w:w="100"/>
+              <w:right w:type="dxa" w:w="80"/>
+            </w:tcMar>
+          </w:tcPr>
+          <w:p>
+            <w:pPr>
+              <w:spacing w:after="0" w:line="240"/>
+              <w:jc w:val="center"/>
+            </w:pPr>
+            <w:r>
+              <w:rPr>
+                <w:rFonts w:ascii="Calibri" w:cs="Calibri" w:eastAsia="Calibri" w:hAnsi="Calibri"/>
+                <w:b/>
+                <w:bCs/>
+                <w:color w:val="FFFFFF"/>
+                <w:sz w:val="12"/>
+                <w:szCs w:val="12"/>
+              </w:rPr>
+              <w:t xml:space="preserve">CORE PRODUCT HUBS</w:t>
+            </w:r>
+          </w:p>
+        </w:tc>
+      </w:tr>
+    </w:tbl>
+    <w:tbl>
+      <w:tblPr>
+        <w:tblW w:type="dxa" w:w="9360"/>
+        <w:tblBorders>
+          <w:top w:val="single" w:color="9AA6B5" w:sz="4"/>
+          <w:left w:val="single" w:color="9AA6B5" w:sz="4"/>
+          <w:bottom w:val="single" w:color="9AA6B5" w:sz="4"/>
+          <w:right w:val="single" w:color="9AA6B5" w:sz="4"/>
+          <w:insideH w:val="single" w:color="9AA6B5" w:sz="4"/>
+          <w:insideV w:val="single" w:color="9AA6B5" w:sz="4"/>
         </w:tblBorders>
       </w:tblPr>
       <w:tblGrid>
@@ -8693,22 +8765,245 @@
       <w:tr>
         <w:tc>
           <w:tcPr>
-            <w:tcW w:type="dxa" w:w="3000"/>
-            <w:gridSpan w:val="3"/>
-            <w:tcBorders>
-              <w:top w:val="single" w:color="16223C" w:sz="4"/>
-              <w:left w:val="single" w:color="16223C" w:sz="4"/>
-              <w:bottom w:val="single" w:color="16223C" w:sz="4"/>
-              <w:right w:val="single" w:color="16223C" w:sz="4"/>
-            </w:tcBorders>
-            <w:shd w:fill="16223C" w:color="auto" w:val="clear"/>
-            <w:tcMar>
-              <w:top w:type="dxa" w:w="90"/>
+            <w:tcW w:type="dxa" w:w="3120"/>
+            <w:tcBorders>
+              <w:top w:val="single" w:color="9AA6B5" w:sz="4"/>
+              <w:left w:val="single" w:color="9AA6B5" w:sz="4"/>
+              <w:bottom w:val="single" w:color="9AA6B5" w:sz="4"/>
+              <w:right w:val="single" w:color="9AA6B5" w:sz="4"/>
+            </w:tcBorders>
+            <w:shd w:fill="F7F8FA" w:color="auto" w:val="clear"/>
+            <w:tcMar>
+              <w:top w:type="dxa" w:w="100"/>
               <w:left w:type="dxa" w:w="80"/>
-              <w:bottom w:type="dxa" w:w="90"/>
+              <w:bottom w:type="dxa" w:w="100"/>
               <w:right w:type="dxa" w:w="80"/>
             </w:tcMar>
-            <w:vAlign w:val="center"/>
+          </w:tcPr>
+          <w:p>
+            <w:pPr>
+              <w:spacing w:after="20" w:line="240"/>
+              <w:jc w:val="center"/>
+            </w:pPr>
+            <w:r>
+              <w:rPr>
+                <w:rFonts w:ascii="Consolas" w:cs="Consolas" w:eastAsia="Consolas" w:hAnsi="Consolas"/>
+                <w:b/>
+                <w:bCs/>
+                <w:color w:val="16223C"/>
+                <w:sz w:val="13"/>
+                <w:szCs w:val="13"/>
+              </w:rPr>
+              <w:t xml:space="preserve">/receptionist</w:t>
+            </w:r>
+          </w:p>
+          <w:p>
+            <w:pPr>
+              <w:spacing w:after="20" w:line="240"/>
+              <w:jc w:val="center"/>
+            </w:pPr>
+            <w:r>
+              <w:rPr>
+                <w:rFonts w:ascii="Calibri" w:cs="Calibri" w:eastAsia="Calibri" w:hAnsi="Calibri"/>
+                <w:b w:val="false"/>
+                <w:bCs w:val="false"/>
+                <w:color w:val="24303F"/>
+                <w:sz w:val="11"/>
+                <w:szCs w:val="11"/>
+              </w:rPr>
+              <w:t xml:space="preserve">pricing · verticals ·</w:t>
+            </w:r>
+          </w:p>
+          <w:p>
+            <w:pPr>
+              <w:spacing w:after="0" w:line="240"/>
+              <w:jc w:val="center"/>
+            </w:pPr>
+            <w:r>
+              <w:rPr>
+                <w:rFonts w:ascii="Calibri" w:cs="Calibri" w:eastAsia="Calibri" w:hAnsi="Calibri"/>
+                <w:b w:val="false"/>
+                <w:bCs w:val="false"/>
+                <w:color w:val="24303F"/>
+                <w:sz w:val="11"/>
+                <w:szCs w:val="11"/>
+              </w:rPr>
+              <w:t xml:space="preserve">answering-service education</w:t>
+            </w:r>
+          </w:p>
+        </w:tc>
+        <w:tc>
+          <w:tcPr>
+            <w:tcW w:type="dxa" w:w="3120"/>
+            <w:tcBorders>
+              <w:top w:val="single" w:color="9AA6B5" w:sz="4"/>
+              <w:left w:val="single" w:color="9AA6B5" w:sz="4"/>
+              <w:bottom w:val="single" w:color="9AA6B5" w:sz="4"/>
+              <w:right w:val="single" w:color="9AA6B5" w:sz="4"/>
+            </w:tcBorders>
+            <w:shd w:fill="F7F8FA" w:color="auto" w:val="clear"/>
+            <w:tcMar>
+              <w:top w:type="dxa" w:w="100"/>
+              <w:left w:type="dxa" w:w="80"/>
+              <w:bottom w:type="dxa" w:w="100"/>
+              <w:right w:type="dxa" w:w="80"/>
+            </w:tcMar>
+          </w:tcPr>
+          <w:p>
+            <w:pPr>
+              <w:spacing w:after="20" w:line="240"/>
+              <w:jc w:val="center"/>
+            </w:pPr>
+            <w:r>
+              <w:rPr>
+                <w:rFonts w:ascii="Consolas" w:cs="Consolas" w:eastAsia="Consolas" w:hAnsi="Consolas"/>
+                <w:b/>
+                <w:bCs/>
+                <w:color w:val="16223C"/>
+                <w:sz w:val="13"/>
+                <w:szCs w:val="13"/>
+              </w:rPr>
+              <w:t xml:space="preserve">/whitelabel</w:t>
+            </w:r>
+          </w:p>
+          <w:p>
+            <w:pPr>
+              <w:spacing w:after="20" w:line="240"/>
+              <w:jc w:val="center"/>
+            </w:pPr>
+            <w:r>
+              <w:rPr>
+                <w:rFonts w:ascii="Calibri" w:cs="Calibri" w:eastAsia="Calibri" w:hAnsi="Calibri"/>
+                <w:b w:val="false"/>
+                <w:bCs w:val="false"/>
+                <w:color w:val="24303F"/>
+                <w:sz w:val="11"/>
+                <w:szCs w:val="11"/>
+              </w:rPr>
+              <w:t xml:space="preserve">academy · industries · compare ·</w:t>
+            </w:r>
+          </w:p>
+          <w:p>
+            <w:pPr>
+              <w:spacing w:after="0" w:line="240"/>
+              <w:jc w:val="center"/>
+            </w:pPr>
+            <w:r>
+              <w:rPr>
+                <w:rFonts w:ascii="Calibri" w:cs="Calibri" w:eastAsia="Calibri" w:hAnsi="Calibri"/>
+                <w:b w:val="false"/>
+                <w:bCs w:val="false"/>
+                <w:color w:val="24303F"/>
+                <w:sz w:val="11"/>
+                <w:szCs w:val="11"/>
+              </w:rPr>
+              <w:t xml:space="preserve">pricing · integrations · partners</w:t>
+            </w:r>
+          </w:p>
+        </w:tc>
+        <w:tc>
+          <w:tcPr>
+            <w:tcW w:type="dxa" w:w="3120"/>
+            <w:tcBorders>
+              <w:top w:val="single" w:color="9AA6B5" w:sz="4"/>
+              <w:left w:val="single" w:color="9AA6B5" w:sz="4"/>
+              <w:bottom w:val="single" w:color="9AA6B5" w:sz="4"/>
+              <w:right w:val="single" w:color="9AA6B5" w:sz="4"/>
+            </w:tcBorders>
+            <w:shd w:fill="F7F8FA" w:color="auto" w:val="clear"/>
+            <w:tcMar>
+              <w:top w:type="dxa" w:w="100"/>
+              <w:left w:type="dxa" w:w="80"/>
+              <w:bottom w:type="dxa" w:w="100"/>
+              <w:right w:type="dxa" w:w="80"/>
+            </w:tcMar>
+          </w:tcPr>
+          <w:p>
+            <w:pPr>
+              <w:spacing w:after="20" w:line="240"/>
+              <w:jc w:val="center"/>
+            </w:pPr>
+            <w:r>
+              <w:rPr>
+                <w:rFonts w:ascii="Consolas" w:cs="Consolas" w:eastAsia="Consolas" w:hAnsi="Consolas"/>
+                <w:b/>
+                <w:bCs/>
+                <w:color w:val="16223C"/>
+                <w:sz w:val="13"/>
+                <w:szCs w:val="13"/>
+              </w:rPr>
+              <w:t xml:space="preserve">/enterprise</w:t>
+            </w:r>
+          </w:p>
+          <w:p>
+            <w:pPr>
+              <w:spacing w:after="20" w:line="240"/>
+              <w:jc w:val="center"/>
+            </w:pPr>
+            <w:r>
+              <w:rPr>
+                <w:rFonts w:ascii="Calibri" w:cs="Calibri" w:eastAsia="Calibri" w:hAnsi="Calibri"/>
+                <w:b w:val="false"/>
+                <w:bCs w:val="false"/>
+                <w:color w:val="24303F"/>
+                <w:sz w:val="11"/>
+                <w:szCs w:val="11"/>
+              </w:rPr>
+              <w:t xml:space="preserve">solutions · deployment ·</w:t>
+            </w:r>
+          </w:p>
+          <w:p>
+            <w:pPr>
+              <w:spacing w:after="0" w:line="240"/>
+              <w:jc w:val="center"/>
+            </w:pPr>
+            <w:r>
+              <w:rPr>
+                <w:rFonts w:ascii="Calibri" w:cs="Calibri" w:eastAsia="Calibri" w:hAnsi="Calibri"/>
+                <w:b w:val="false"/>
+                <w:bCs w:val="false"/>
+                <w:color w:val="24303F"/>
+                <w:sz w:val="11"/>
+                <w:szCs w:val="11"/>
+              </w:rPr>
+              <w:t xml:space="preserve">enterprise integrations</w:t>
+            </w:r>
+          </w:p>
+        </w:tc>
+      </w:tr>
+    </w:tbl>
+    <w:tbl>
+      <w:tblPr>
+        <w:tblW w:type="dxa" w:w="9360"/>
+        <w:tblBorders>
+          <w:top w:val="single" w:color="9AA6B5" w:sz="4"/>
+          <w:left w:val="single" w:color="9AA6B5" w:sz="4"/>
+          <w:bottom w:val="single" w:color="9AA6B5" w:sz="4"/>
+          <w:right w:val="single" w:color="9AA6B5" w:sz="4"/>
+          <w:insideH w:val="single" w:color="9AA6B5" w:sz="4"/>
+          <w:insideV w:val="single" w:color="9AA6B5" w:sz="4"/>
+        </w:tblBorders>
+      </w:tblPr>
+      <w:tblGrid>
+        <w:gridCol w:w="9360"/>
+      </w:tblGrid>
+      <w:tr>
+        <w:tc>
+          <w:tcPr>
+            <w:tcW w:type="dxa" w:w="9360"/>
+            <w:tcBorders>
+              <w:top w:val="single" w:color="9AA6B5" w:sz="4"/>
+              <w:left w:val="single" w:color="9AA6B5" w:sz="4"/>
+              <w:bottom w:val="single" w:color="9AA6B5" w:sz="4"/>
+              <w:right w:val="single" w:color="9AA6B5" w:sz="4"/>
+            </w:tcBorders>
+            <w:shd w:fill="9A6B3F" w:color="auto" w:val="clear"/>
+            <w:tcMar>
+              <w:top w:type="dxa" w:w="100"/>
+              <w:left w:type="dxa" w:w="80"/>
+              <w:bottom w:type="dxa" w:w="100"/>
+              <w:right w:type="dxa" w:w="80"/>
+            </w:tcMar>
           </w:tcPr>
           <w:p>
             <w:pPr>
@@ -8724,30 +9019,46 @@
                 <w:sz w:val="12"/>
                 <w:szCs w:val="12"/>
               </w:rPr>
-              <w:t xml:space="preserve">CORE HUBS</w:t>
+              <w:t xml:space="preserve">CROSS-CUTTING HUBS</w:t>
             </w:r>
           </w:p>
         </w:tc>
       </w:tr>
+    </w:tbl>
+    <w:tbl>
+      <w:tblPr>
+        <w:tblW w:type="dxa" w:w="9360"/>
+        <w:tblBorders>
+          <w:top w:val="single" w:color="9AA6B5" w:sz="4"/>
+          <w:left w:val="single" w:color="9AA6B5" w:sz="4"/>
+          <w:bottom w:val="single" w:color="9AA6B5" w:sz="4"/>
+          <w:right w:val="single" w:color="9AA6B5" w:sz="4"/>
+          <w:insideH w:val="single" w:color="9AA6B5" w:sz="4"/>
+          <w:insideV w:val="single" w:color="9AA6B5" w:sz="4"/>
+        </w:tblBorders>
+      </w:tblPr>
+      <w:tblGrid>
+        <w:gridCol w:w="3120"/>
+        <w:gridCol w:w="3120"/>
+        <w:gridCol w:w="3120"/>
+      </w:tblGrid>
       <w:tr>
         <w:tc>
           <w:tcPr>
-            <w:tcW w:type="dxa" w:w="3000"/>
-            <w:gridSpan w:val="1"/>
-            <w:tcBorders>
-              <w:top w:val="single" w:color="D9DEE8" w:sz="4"/>
-              <w:left w:val="single" w:color="D9DEE8" w:sz="4"/>
-              <w:bottom w:val="single" w:color="D9DEE8" w:sz="4"/>
-              <w:right w:val="single" w:color="D9DEE8" w:sz="4"/>
-            </w:tcBorders>
-            <w:shd w:fill="F7F8FA" w:color="auto" w:val="clear"/>
-            <w:tcMar>
-              <w:top w:type="dxa" w:w="90"/>
+            <w:tcW w:type="dxa" w:w="3120"/>
+            <w:tcBorders>
+              <w:top w:val="single" w:color="9AA6B5" w:sz="4"/>
+              <w:left w:val="single" w:color="9AA6B5" w:sz="4"/>
+              <w:bottom w:val="single" w:color="9AA6B5" w:sz="4"/>
+              <w:right w:val="single" w:color="9AA6B5" w:sz="4"/>
+            </w:tcBorders>
+            <w:shd w:fill="EDEFF3" w:color="auto" w:val="clear"/>
+            <w:tcMar>
+              <w:top w:type="dxa" w:w="100"/>
               <w:left w:type="dxa" w:w="80"/>
-              <w:bottom w:type="dxa" w:w="90"/>
+              <w:bottom w:type="dxa" w:w="100"/>
               <w:right w:type="dxa" w:w="80"/>
             </w:tcMar>
-            <w:vAlign w:val="center"/>
           </w:tcPr>
           <w:p>
             <w:pPr>
@@ -8763,12 +9074,12 @@
                 <w:sz w:val="13"/>
                 <w:szCs w:val="13"/>
               </w:rPr>
-              <w:t xml:space="preserve">/receptionist</w:t>
-            </w:r>
-          </w:p>
-          <w:p>
-            <w:pPr>
-              <w:spacing w:after="20" w:line="240"/>
+              <w:t xml:space="preserve">/security</w:t>
+            </w:r>
+          </w:p>
+          <w:p>
+            <w:pPr>
+              <w:spacing w:after="0" w:line="240"/>
               <w:jc w:val="center"/>
             </w:pPr>
             <w:r>
@@ -8780,45 +9091,26 @@
                 <w:sz w:val="11"/>
                 <w:szCs w:val="11"/>
               </w:rPr>
-              <w:t xml:space="preserve">pricing · verticals ·</w:t>
-            </w:r>
-          </w:p>
-          <w:p>
-            <w:pPr>
-              <w:spacing w:after="0" w:line="240"/>
-              <w:jc w:val="center"/>
-            </w:pPr>
-            <w:r>
-              <w:rPr>
-                <w:rFonts w:ascii="Calibri" w:cs="Calibri" w:eastAsia="Calibri" w:hAnsi="Calibri"/>
-                <w:b w:val="false"/>
-                <w:bCs w:val="false"/>
-                <w:color w:val="24303F"/>
-                <w:sz w:val="11"/>
-                <w:szCs w:val="11"/>
-              </w:rPr>
-              <w:t xml:space="preserve">answering-service education</w:t>
-            </w:r>
-          </w:p>
-        </w:tc>
-        <w:tc>
-          <w:tcPr>
-            <w:tcW w:type="dxa" w:w="3000"/>
-            <w:gridSpan w:val="1"/>
-            <w:tcBorders>
-              <w:top w:val="single" w:color="D9DEE8" w:sz="4"/>
-              <w:left w:val="single" w:color="D9DEE8" w:sz="4"/>
-              <w:bottom w:val="single" w:color="D9DEE8" w:sz="4"/>
-              <w:right w:val="single" w:color="D9DEE8" w:sz="4"/>
-            </w:tcBorders>
-            <w:shd w:fill="F7F8FA" w:color="auto" w:val="clear"/>
-            <w:tcMar>
-              <w:top w:type="dxa" w:w="90"/>
+              <w:t xml:space="preserve">compliance &amp; regulation</w:t>
+            </w:r>
+          </w:p>
+        </w:tc>
+        <w:tc>
+          <w:tcPr>
+            <w:tcW w:type="dxa" w:w="3120"/>
+            <w:tcBorders>
+              <w:top w:val="single" w:color="9AA6B5" w:sz="4"/>
+              <w:left w:val="single" w:color="9AA6B5" w:sz="4"/>
+              <w:bottom w:val="single" w:color="9AA6B5" w:sz="4"/>
+              <w:right w:val="single" w:color="9AA6B5" w:sz="4"/>
+            </w:tcBorders>
+            <w:shd w:fill="EDEFF3" w:color="auto" w:val="clear"/>
+            <w:tcMar>
+              <w:top w:type="dxa" w:w="100"/>
               <w:left w:type="dxa" w:w="80"/>
-              <w:bottom w:type="dxa" w:w="90"/>
+              <w:bottom w:type="dxa" w:w="100"/>
               <w:right w:type="dxa" w:w="80"/>
             </w:tcMar>
-            <w:vAlign w:val="center"/>
           </w:tcPr>
           <w:p>
             <w:pPr>
@@ -8834,12 +9126,12 @@
                 <w:sz w:val="13"/>
                 <w:szCs w:val="13"/>
               </w:rPr>
-              <w:t xml:space="preserve">/whitelabel</w:t>
-            </w:r>
-          </w:p>
-          <w:p>
-            <w:pPr>
-              <w:spacing w:after="20" w:line="240"/>
+              <w:t xml:space="preserve">/compare</w:t>
+            </w:r>
+          </w:p>
+          <w:p>
+            <w:pPr>
+              <w:spacing w:after="0" w:line="240"/>
               <w:jc w:val="center"/>
             </w:pPr>
             <w:r>
@@ -8851,265 +9143,26 @@
                 <w:sz w:val="11"/>
                 <w:szCs w:val="11"/>
               </w:rPr>
-              <w:t xml:space="preserve">academy · industries · compare ·</w:t>
-            </w:r>
-          </w:p>
-          <w:p>
-            <w:pPr>
-              <w:spacing w:after="0" w:line="240"/>
-              <w:jc w:val="center"/>
-            </w:pPr>
-            <w:r>
-              <w:rPr>
-                <w:rFonts w:ascii="Calibri" w:cs="Calibri" w:eastAsia="Calibri" w:hAnsi="Calibri"/>
-                <w:b w:val="false"/>
-                <w:bCs w:val="false"/>
-                <w:color w:val="24303F"/>
-                <w:sz w:val="11"/>
-                <w:szCs w:val="11"/>
-              </w:rPr>
-              <w:t xml:space="preserve">pricing · integrations · partners</w:t>
-            </w:r>
-          </w:p>
-        </w:tc>
-        <w:tc>
-          <w:tcPr>
-            <w:tcW w:type="dxa" w:w="3000"/>
-            <w:gridSpan w:val="1"/>
-            <w:tcBorders>
-              <w:top w:val="single" w:color="D9DEE8" w:sz="4"/>
-              <w:left w:val="single" w:color="D9DEE8" w:sz="4"/>
-              <w:bottom w:val="single" w:color="D9DEE8" w:sz="4"/>
-              <w:right w:val="single" w:color="D9DEE8" w:sz="4"/>
-            </w:tcBorders>
-            <w:shd w:fill="F7F8FA" w:color="auto" w:val="clear"/>
-            <w:tcMar>
-              <w:top w:type="dxa" w:w="90"/>
+              <w:t xml:space="preserve">competitors &amp; categories</w:t>
+            </w:r>
+          </w:p>
+        </w:tc>
+        <w:tc>
+          <w:tcPr>
+            <w:tcW w:type="dxa" w:w="3120"/>
+            <w:tcBorders>
+              <w:top w:val="single" w:color="9AA6B5" w:sz="4"/>
+              <w:left w:val="single" w:color="9AA6B5" w:sz="4"/>
+              <w:bottom w:val="single" w:color="9AA6B5" w:sz="4"/>
+              <w:right w:val="single" w:color="9AA6B5" w:sz="4"/>
+            </w:tcBorders>
+            <w:shd w:fill="EDEFF3" w:color="auto" w:val="clear"/>
+            <w:tcMar>
+              <w:top w:type="dxa" w:w="100"/>
               <w:left w:type="dxa" w:w="80"/>
-              <w:bottom w:type="dxa" w:w="90"/>
+              <w:bottom w:type="dxa" w:w="100"/>
               <w:right w:type="dxa" w:w="80"/>
             </w:tcMar>
-            <w:vAlign w:val="center"/>
-          </w:tcPr>
-          <w:p>
-            <w:pPr>
-              <w:spacing w:after="20" w:line="240"/>
-              <w:jc w:val="center"/>
-            </w:pPr>
-            <w:r>
-              <w:rPr>
-                <w:rFonts w:ascii="Consolas" w:cs="Consolas" w:eastAsia="Consolas" w:hAnsi="Consolas"/>
-                <w:b/>
-                <w:bCs/>
-                <w:color w:val="16223C"/>
-                <w:sz w:val="13"/>
-                <w:szCs w:val="13"/>
-              </w:rPr>
-              <w:t xml:space="preserve">/enterprise</w:t>
-            </w:r>
-          </w:p>
-          <w:p>
-            <w:pPr>
-              <w:spacing w:after="20" w:line="240"/>
-              <w:jc w:val="center"/>
-            </w:pPr>
-            <w:r>
-              <w:rPr>
-                <w:rFonts w:ascii="Calibri" w:cs="Calibri" w:eastAsia="Calibri" w:hAnsi="Calibri"/>
-                <w:b w:val="false"/>
-                <w:bCs w:val="false"/>
-                <w:color w:val="24303F"/>
-                <w:sz w:val="11"/>
-                <w:szCs w:val="11"/>
-              </w:rPr>
-              <w:t xml:space="preserve">solutions · deployment ·</w:t>
-            </w:r>
-          </w:p>
-          <w:p>
-            <w:pPr>
-              <w:spacing w:after="0" w:line="240"/>
-              <w:jc w:val="center"/>
-            </w:pPr>
-            <w:r>
-              <w:rPr>
-                <w:rFonts w:ascii="Calibri" w:cs="Calibri" w:eastAsia="Calibri" w:hAnsi="Calibri"/>
-                <w:b w:val="false"/>
-                <w:bCs w:val="false"/>
-                <w:color w:val="24303F"/>
-                <w:sz w:val="11"/>
-                <w:szCs w:val="11"/>
-              </w:rPr>
-              <w:t xml:space="preserve">enterprise integrations</w:t>
-            </w:r>
-          </w:p>
-        </w:tc>
-      </w:tr>
-      <w:tr>
-        <w:tc>
-          <w:tcPr>
-            <w:tcW w:type="dxa" w:w="3000"/>
-            <w:gridSpan w:val="3"/>
-            <w:tcBorders>
-              <w:top w:val="single" w:color="9A6B3F" w:sz="4"/>
-              <w:left w:val="single" w:color="9A6B3F" w:sz="4"/>
-              <w:bottom w:val="single" w:color="9A6B3F" w:sz="4"/>
-              <w:right w:val="single" w:color="9A6B3F" w:sz="4"/>
-            </w:tcBorders>
-            <w:shd w:fill="9A6B3F" w:color="auto" w:val="clear"/>
-            <w:tcMar>
-              <w:top w:type="dxa" w:w="90"/>
-              <w:left w:type="dxa" w:w="80"/>
-              <w:bottom w:type="dxa" w:w="90"/>
-              <w:right w:type="dxa" w:w="80"/>
-            </w:tcMar>
-            <w:vAlign w:val="center"/>
-          </w:tcPr>
-          <w:p>
-            <w:pPr>
-              <w:spacing w:after="0" w:line="240"/>
-              <w:jc w:val="center"/>
-            </w:pPr>
-            <w:r>
-              <w:rPr>
-                <w:rFonts w:ascii="Calibri" w:cs="Calibri" w:eastAsia="Calibri" w:hAnsi="Calibri"/>
-                <w:b/>
-                <w:bCs/>
-                <w:color w:val="FFFFFF"/>
-                <w:sz w:val="12"/>
-                <w:szCs w:val="12"/>
-              </w:rPr>
-              <w:t xml:space="preserve">CROSS-CUTTING HUBS</w:t>
-            </w:r>
-          </w:p>
-        </w:tc>
-      </w:tr>
-      <w:tr>
-        <w:tc>
-          <w:tcPr>
-            <w:tcW w:type="dxa" w:w="3000"/>
-            <w:gridSpan w:val="1"/>
-            <w:tcBorders>
-              <w:top w:val="single" w:color="D9DEE8" w:sz="4"/>
-              <w:left w:val="single" w:color="D9DEE8" w:sz="4"/>
-              <w:bottom w:val="single" w:color="D9DEE8" w:sz="4"/>
-              <w:right w:val="single" w:color="D9DEE8" w:sz="4"/>
-            </w:tcBorders>
-            <w:shd w:fill="EDEFF3" w:color="auto" w:val="clear"/>
-            <w:tcMar>
-              <w:top w:type="dxa" w:w="90"/>
-              <w:left w:type="dxa" w:w="80"/>
-              <w:bottom w:type="dxa" w:w="90"/>
-              <w:right w:type="dxa" w:w="80"/>
-            </w:tcMar>
-            <w:vAlign w:val="center"/>
-          </w:tcPr>
-          <w:p>
-            <w:pPr>
-              <w:spacing w:after="20" w:line="240"/>
-              <w:jc w:val="center"/>
-            </w:pPr>
-            <w:r>
-              <w:rPr>
-                <w:rFonts w:ascii="Consolas" w:cs="Consolas" w:eastAsia="Consolas" w:hAnsi="Consolas"/>
-                <w:b/>
-                <w:bCs/>
-                <w:color w:val="16223C"/>
-                <w:sz w:val="13"/>
-                <w:szCs w:val="13"/>
-              </w:rPr>
-              <w:t xml:space="preserve">/security</w:t>
-            </w:r>
-          </w:p>
-          <w:p>
-            <w:pPr>
-              <w:spacing w:after="0" w:line="240"/>
-              <w:jc w:val="center"/>
-            </w:pPr>
-            <w:r>
-              <w:rPr>
-                <w:rFonts w:ascii="Calibri" w:cs="Calibri" w:eastAsia="Calibri" w:hAnsi="Calibri"/>
-                <w:b w:val="false"/>
-                <w:bCs w:val="false"/>
-                <w:color w:val="24303F"/>
-                <w:sz w:val="11"/>
-                <w:szCs w:val="11"/>
-              </w:rPr>
-              <w:t xml:space="preserve">compliance &amp; regulation</w:t>
-            </w:r>
-          </w:p>
-        </w:tc>
-        <w:tc>
-          <w:tcPr>
-            <w:tcW w:type="dxa" w:w="3000"/>
-            <w:gridSpan w:val="1"/>
-            <w:tcBorders>
-              <w:top w:val="single" w:color="D9DEE8" w:sz="4"/>
-              <w:left w:val="single" w:color="D9DEE8" w:sz="4"/>
-              <w:bottom w:val="single" w:color="D9DEE8" w:sz="4"/>
-              <w:right w:val="single" w:color="D9DEE8" w:sz="4"/>
-            </w:tcBorders>
-            <w:shd w:fill="EDEFF3" w:color="auto" w:val="clear"/>
-            <w:tcMar>
-              <w:top w:type="dxa" w:w="90"/>
-              <w:left w:type="dxa" w:w="80"/>
-              <w:bottom w:type="dxa" w:w="90"/>
-              <w:right w:type="dxa" w:w="80"/>
-            </w:tcMar>
-            <w:vAlign w:val="center"/>
-          </w:tcPr>
-          <w:p>
-            <w:pPr>
-              <w:spacing w:after="20" w:line="240"/>
-              <w:jc w:val="center"/>
-            </w:pPr>
-            <w:r>
-              <w:rPr>
-                <w:rFonts w:ascii="Consolas" w:cs="Consolas" w:eastAsia="Consolas" w:hAnsi="Consolas"/>
-                <w:b/>
-                <w:bCs/>
-                <w:color w:val="16223C"/>
-                <w:sz w:val="13"/>
-                <w:szCs w:val="13"/>
-              </w:rPr>
-              <w:t xml:space="preserve">/compare</w:t>
-            </w:r>
-          </w:p>
-          <w:p>
-            <w:pPr>
-              <w:spacing w:after="0" w:line="240"/>
-              <w:jc w:val="center"/>
-            </w:pPr>
-            <w:r>
-              <w:rPr>
-                <w:rFonts w:ascii="Calibri" w:cs="Calibri" w:eastAsia="Calibri" w:hAnsi="Calibri"/>
-                <w:b w:val="false"/>
-                <w:bCs w:val="false"/>
-                <w:color w:val="24303F"/>
-                <w:sz w:val="11"/>
-                <w:szCs w:val="11"/>
-              </w:rPr>
-              <w:t xml:space="preserve">competitors &amp; categories</w:t>
-            </w:r>
-          </w:p>
-        </w:tc>
-        <w:tc>
-          <w:tcPr>
-            <w:tcW w:type="dxa" w:w="3000"/>
-            <w:gridSpan w:val="1"/>
-            <w:tcBorders>
-              <w:top w:val="single" w:color="D9DEE8" w:sz="4"/>
-              <w:left w:val="single" w:color="D9DEE8" w:sz="4"/>
-              <w:bottom w:val="single" w:color="D9DEE8" w:sz="4"/>
-              <w:right w:val="single" w:color="D9DEE8" w:sz="4"/>
-            </w:tcBorders>
-            <w:shd w:fill="EDEFF3" w:color="auto" w:val="clear"/>
-            <w:tcMar>
-              <w:top w:type="dxa" w:w="90"/>
-              <w:left w:type="dxa" w:w="80"/>
-              <w:bottom w:type="dxa" w:w="90"/>
-              <w:right w:type="dxa" w:w="80"/>
-            </w:tcMar>
-            <w:vAlign w:val="center"/>
           </w:tcPr>
           <w:p>
             <w:pPr>
@@ -9125,7 +9178,7 @@
                 <w:sz w:val="12"/>
                 <w:szCs w:val="12"/>
               </w:rPr>
-              <w:t xml:space="preserve">/platform  ·  Resources</w:t>
+              <w:t xml:space="preserve">/platform · Resources</w:t>
             </w:r>
           </w:p>
           <w:p>
@@ -9892,11 +9945,24 @@
       <w:r>
         <w:rPr>
           <w:rFonts w:ascii="Calibri" w:cs="Calibri" w:eastAsia="Calibri" w:hAnsi="Calibri"/>
+          <w:b/>
+          <w:bCs/>
           <w:color w:val="24303F"/>
           <w:sz w:val="19"/>
           <w:szCs w:val="19"/>
         </w:rPr>
-        <w:t xml:space="default"/>
+        <w:t xml:space="preserve">URL inventory: </w:t>
+      </w:r>
+      <w:r>
+        <w:rPr>
+          <w:rFonts w:ascii="Calibri" w:cs="Calibri" w:eastAsia="Calibri" w:hAnsi="Calibri"/>
+          <w:b w:val="false"/>
+          <w:bCs w:val="false"/>
+          <w:color w:val="24303F"/>
+          <w:sz w:val="19"/>
+          <w:szCs w:val="19"/>
+        </w:rPr>
+        <w:t xml:space="preserve">the live XML sitemap (488 URLs), classified by path and content theme.</w:t>
       </w:r>
     </w:p>
     <w:p>
@@ -9911,11 +9977,24 @@
       <w:r>
         <w:rPr>
           <w:rFonts w:ascii="Calibri" w:cs="Calibri" w:eastAsia="Calibri" w:hAnsi="Calibri"/>
+          <w:b/>
+          <w:bCs/>
           <w:color w:val="24303F"/>
           <w:sz w:val="19"/>
           <w:szCs w:val="19"/>
         </w:rPr>
-        <w:t xml:space="default"/>
+        <w:t xml:space="preserve">Performance data: </w:t>
+      </w:r>
+      <w:r>
+        <w:rPr>
+          <w:rFonts w:ascii="Calibri" w:cs="Calibri" w:eastAsia="Calibri" w:hAnsi="Calibri"/>
+          <w:b w:val="false"/>
+          <w:bCs w:val="false"/>
+          <w:color w:val="24303F"/>
+          <w:sz w:val="19"/>
+          <w:szCs w:val="19"/>
+        </w:rPr>
+        <w:t xml:space="preserve">16 months of Search Console query and page data for trillet.ai.</w:t>
       </w:r>
     </w:p>
     <w:p>
@@ -9930,11 +10009,24 @@
       <w:r>
         <w:rPr>
           <w:rFonts w:ascii="Calibri" w:cs="Calibri" w:eastAsia="Calibri" w:hAnsi="Calibri"/>
+          <w:b/>
+          <w:bCs/>
           <w:color w:val="24303F"/>
           <w:sz w:val="19"/>
           <w:szCs w:val="19"/>
         </w:rPr>
-        <w:t xml:space="default"/>
+        <w:t xml:space="preserve">Competitor keywords: </w:t>
+      </w:r>
+      <w:r>
+        <w:rPr>
+          <w:rFonts w:ascii="Calibri" w:cs="Calibri" w:eastAsia="Calibri" w:hAnsi="Calibri"/>
+          <w:b w:val="false"/>
+          <w:bCs w:val="false"/>
+          <w:color w:val="24303F"/>
+          <w:sz w:val="19"/>
+          <w:szCs w:val="19"/>
+        </w:rPr>
+        <w:t xml:space="preserve">organic-position data for nineteen competitors and for trillet.ai, United States market.</w:t>
       </w:r>
     </w:p>
     <w:p>
@@ -9949,11 +10041,24 @@
       <w:r>
         <w:rPr>
           <w:rFonts w:ascii="Calibri" w:cs="Calibri" w:eastAsia="Calibri" w:hAnsi="Calibri"/>
+          <w:b/>
+          <w:bCs/>
           <w:color w:val="24303F"/>
           <w:sz w:val="19"/>
           <w:szCs w:val="19"/>
         </w:rPr>
-        <w:t xml:space="default"/>
+        <w:t xml:space="preserve">Completeness ratings: </w:t>
+      </w:r>
+      <w:r>
+        <w:rPr>
+          <w:rFonts w:ascii="Calibri" w:cs="Calibri" w:eastAsia="Calibri" w:hAnsi="Calibri"/>
+          <w:b w:val="false"/>
+          <w:bCs w:val="false"/>
+          <w:color w:val="24303F"/>
+          <w:sz w:val="19"/>
+          <w:szCs w:val="19"/>
+        </w:rPr>
+        <w:t xml:space="preserve">combine page count, hub presence, sub-cluster intent coverage and current ranking position.</w:t>
       </w:r>
     </w:p>
     <w:p>
@@ -9968,11 +10073,24 @@
       <w:r>
         <w:rPr>
           <w:rFonts w:ascii="Calibri" w:cs="Calibri" w:eastAsia="Calibri" w:hAnsi="Calibri"/>
+          <w:b/>
+          <w:bCs/>
           <w:color w:val="24303F"/>
           <w:sz w:val="19"/>
           <w:szCs w:val="19"/>
         </w:rPr>
-        <w:t xml:space="default"/>
+        <w:t xml:space="preserve">Scope limitation: </w:t>
+      </w:r>
+      <w:r>
+        <w:rPr>
+          <w:rFonts w:ascii="Calibri" w:cs="Calibri" w:eastAsia="Calibri" w:hAnsi="Calibri"/>
+          <w:b w:val="false"/>
+          <w:bCs w:val="false"/>
+          <w:color w:val="24303F"/>
+          <w:sz w:val="19"/>
+          <w:szCs w:val="19"/>
+        </w:rPr>
+        <w:t xml:space="preserve">keyword data reflects the United States market; Australian and United Kingdom coverage is recommended for a subsequent pass.</w:t>
       </w:r>
     </w:p>
     <w:sectPr>

</xml_diff>